<commit_message>
Expand existing migration packs with 15 coverage modules and DDIC preflight
</commit_message>
<xml_diff>
--- a/docs/customer/domains/ModuPorter-Domain-Documentation-DE.docx
+++ b/docs/customer/domains/ModuPorter-Domain-Documentation-DE.docx
@@ -12,7 +12,7 @@
     </w:p>
     <w:p>
       <w:r>
-        <w:t>Version 0.1.0  |  10. Oktober 2026</w:t>
+        <w:t>Version 0.2.0  |  11. Oktober 2026</w:t>
       </w:r>
     </w:p>
     <w:p>
@@ -437,7 +437,7 @@
                 <w:color w:val="000000"/>
                 <w:sz w:val="20"/>
               </w:rPr>
-              <w:t>5</w:t>
+              <w:t>7</w:t>
             </w:r>
           </w:p>
         </w:tc>
@@ -470,7 +470,7 @@
                 <w:color w:val="000000"/>
                 <w:sz w:val="20"/>
               </w:rPr>
-              <w:t>21</w:t>
+              <w:t>26</w:t>
             </w:r>
           </w:p>
         </w:tc>
@@ -503,7 +503,7 @@
                 <w:color w:val="000000"/>
                 <w:sz w:val="20"/>
               </w:rPr>
-              <w:t>68</w:t>
+              <w:t>85</w:t>
             </w:r>
           </w:p>
         </w:tc>
@@ -606,7 +606,7 @@
                 <w:color w:val="000000"/>
                 <w:sz w:val="20"/>
               </w:rPr>
-              <w:t>4</w:t>
+              <w:t>6</w:t>
             </w:r>
           </w:p>
         </w:tc>
@@ -639,7 +639,7 @@
                 <w:color w:val="000000"/>
                 <w:sz w:val="20"/>
               </w:rPr>
-              <w:t>15</w:t>
+              <w:t>18</w:t>
             </w:r>
           </w:p>
         </w:tc>
@@ -672,7 +672,7 @@
                 <w:color w:val="000000"/>
                 <w:sz w:val="20"/>
               </w:rPr>
-              <w:t>49</w:t>
+              <w:t>60</w:t>
             </w:r>
           </w:p>
         </w:tc>
@@ -775,7 +775,7 @@
                 <w:color w:val="000000"/>
                 <w:sz w:val="20"/>
               </w:rPr>
-              <w:t>3</w:t>
+              <w:t>7</w:t>
             </w:r>
           </w:p>
         </w:tc>
@@ -808,7 +808,7 @@
                 <w:color w:val="000000"/>
                 <w:sz w:val="20"/>
               </w:rPr>
-              <w:t>4</w:t>
+              <w:t>14</w:t>
             </w:r>
           </w:p>
         </w:tc>
@@ -841,7 +841,7 @@
                 <w:color w:val="000000"/>
                 <w:sz w:val="20"/>
               </w:rPr>
-              <w:t>15</w:t>
+              <w:t>49</w:t>
             </w:r>
           </w:p>
         </w:tc>
@@ -944,7 +944,7 @@
                 <w:color w:val="000000"/>
                 <w:sz w:val="20"/>
               </w:rPr>
-              <w:t>4</w:t>
+              <w:t>6</w:t>
             </w:r>
           </w:p>
         </w:tc>
@@ -977,7 +977,7 @@
                 <w:color w:val="000000"/>
                 <w:sz w:val="20"/>
               </w:rPr>
-              <w:t>15</w:t>
+              <w:t>17</w:t>
             </w:r>
           </w:p>
         </w:tc>
@@ -1010,7 +1010,7 @@
                 <w:color w:val="000000"/>
                 <w:sz w:val="20"/>
               </w:rPr>
-              <w:t>49</w:t>
+              <w:t>57</w:t>
             </w:r>
           </w:p>
         </w:tc>
@@ -1113,7 +1113,7 @@
                 <w:color w:val="000000"/>
                 <w:sz w:val="20"/>
               </w:rPr>
-              <w:t>5</w:t>
+              <w:t>7</w:t>
             </w:r>
           </w:p>
         </w:tc>
@@ -1146,7 +1146,7 @@
                 <w:color w:val="000000"/>
                 <w:sz w:val="20"/>
               </w:rPr>
-              <w:t>9</w:t>
+              <w:t>13</w:t>
             </w:r>
           </w:p>
         </w:tc>
@@ -1179,7 +1179,7 @@
                 <w:color w:val="000000"/>
                 <w:sz w:val="20"/>
               </w:rPr>
-              <w:t>32</w:t>
+              <w:t>46</w:t>
             </w:r>
           </w:p>
         </w:tc>
@@ -1282,7 +1282,7 @@
                 <w:color w:val="000000"/>
                 <w:sz w:val="20"/>
               </w:rPr>
-              <w:t>5</w:t>
+              <w:t>7</w:t>
             </w:r>
           </w:p>
         </w:tc>
@@ -1315,7 +1315,7 @@
                 <w:color w:val="000000"/>
                 <w:sz w:val="20"/>
               </w:rPr>
-              <w:t>17</w:t>
+              <w:t>20</w:t>
             </w:r>
           </w:p>
         </w:tc>
@@ -1348,7 +1348,7 @@
                 <w:color w:val="000000"/>
                 <w:sz w:val="20"/>
               </w:rPr>
-              <w:t>56</w:t>
+              <w:t>67</w:t>
             </w:r>
           </w:p>
         </w:tc>
@@ -1451,7 +1451,7 @@
                 <w:color w:val="000000"/>
                 <w:sz w:val="20"/>
               </w:rPr>
-              <w:t>3</w:t>
+              <w:t>4</w:t>
             </w:r>
           </w:p>
         </w:tc>
@@ -1484,7 +1484,7 @@
                 <w:color w:val="000000"/>
                 <w:sz w:val="20"/>
               </w:rPr>
-              <w:t>12</w:t>
+              <w:t>16</w:t>
             </w:r>
           </w:p>
         </w:tc>
@@ -1517,7 +1517,7 @@
                 <w:color w:val="000000"/>
                 <w:sz w:val="20"/>
               </w:rPr>
-              <w:t>39</w:t>
+              <w:t>52</w:t>
             </w:r>
           </w:p>
         </w:tc>
@@ -1559,7 +1559,7 @@
     <w:p/>
     <w:p>
       <w:r>
-        <w:t>Insgesamt 32 Fachmodule, 98 Extraktionsstrukturen, 722 zugeordnete Felder und 362 CDS Views. Jede Struktur hat einen CSV Vertrag für den Zielvergleich. Die 36 S4 Views sind Kandidaten für ausgewählte Hauptobjekte. Bestehende analytische Berichte bleiben in ihren ursprünglichen Produktordnern.</w:t>
+        <w:t>Insgesamt 47 Fachmodule, 129 Extraktionsstrukturen, 1164 zugeordnete Felder und 470 CDS Views. Jede Struktur hat einen CSV Vertrag für den Zielvergleich. Die 36 S4 Views sind Kandidaten für ausgewählte Hauptobjekte. Bestehende analytische Berichte bleiben in ihren ursprünglichen Produktordnern.</w:t>
       </w:r>
     </w:p>
     <w:p>
@@ -1689,12 +1689,12 @@
     </w:p>
     <w:p>
       <w:r>
-        <w:t>Module: product, material_stock, goods_movement, purchase_requisition, purchase_order.</w:t>
+        <w:t>Module: product, material_stock, goods_movement, purchase_requisition, purchase_order, purchasing_info_record, purchasing_contract.</w:t>
       </w:r>
     </w:p>
     <w:p>
       <w:r>
-        <w:t>Quelltabellen: EBAN, EBKN, EKBE, EKET, EKKN, EKKO, EKPO, MAKT, MARA, MARC, MARD, MARM, MBEW, MCH1, MCHA, MCHB, MKPF, MSEG, MSKA, MSLB.</w:t>
+        <w:t>Quelltabellen: EBAN, EBKN, EINA, EINE, EKBE, EKET, EKKN, EKKO, EKPO, MAKT, MARA, MARC, MARD, MARM, MBEW, MCH1, MCHA, MCHB, MKPF, MSEG, MSKA, MSLB.</w:t>
       </w:r>
     </w:p>
     <w:p>
@@ -1730,12 +1730,12 @@
     </w:p>
     <w:p>
       <w:r>
-        <w:t>Module: inspection_lot, inspection_result, quality_notification, inspection_plan.</w:t>
+        <w:t>Module: inspection_lot, inspection_result, quality_notification, inspection_plan, master_inspection_characteristic, sampling_procedure.</w:t>
       </w:r>
     </w:p>
     <w:p>
       <w:r>
-        <w:t>Quelltabellen: MAPL, PLAS, PLKO, PLMK, PLPO, QALS, QAMR, QAMV, QASE, QAVE, QMEL, QMFE, QMMA, QMSM, QMUR.</w:t>
+        <w:t>Quelltabellen: MAPL, PLAS, PLKO, PLMK, PLPO, QALS, QAMR, QAMV, QASE, QAVE, QDSV, QMEL, QMFE, QMMA, QMSM, QMUR, QPMK, QPMT.</w:t>
       </w:r>
     </w:p>
     <w:p>
@@ -1758,12 +1758,12 @@
     </w:p>
     <w:p>
       <w:r>
-        <w:t>Module: project, wbs_element, project_cost.</w:t>
+        <w:t>Module: project, wbs_element, project_cost, network, budget, commitment, investment_measure.</w:t>
       </w:r>
     </w:p>
     <w:p>
       <w:r>
-        <w:t>Quelltabellen: COEP, PRHI, PROJ, PRPS.</w:t>
+        <w:t>Quelltabellen: AFKO, AFVC, AFVV, AUFK, BPGE, BPJA, COEP, COOI, IMPR, IMTP, IMZO, PRHI, PROJ, PRPS.</w:t>
       </w:r>
     </w:p>
     <w:p>
@@ -1799,12 +1799,12 @@
     </w:p>
     <w:p>
       <w:r>
-        <w:t>Module: production_order, production_order_operation, bill_of_material, routing.</w:t>
+        <w:t>Module: production_order, production_order_operation, bill_of_material, routing, production_version, production_confirmation.</w:t>
       </w:r>
     </w:p>
     <w:p>
       <w:r>
-        <w:t>Quelltabellen: AFKO, AFPO, AFVC, AFVV, AUFK, MAPL, MAST, PLAS, PLFL, PLKO, PLPO, RESB, STAS, STKO, STPO.</w:t>
+        <w:t>Quelltabellen: AFKO, AFPO, AFRU, AFVC, AFVV, AUFK, MAPL, MAST, MKAL, PLAS, PLFL, PLKO, PLPO, RESB, STAS, STKO, STPO.</w:t>
       </w:r>
     </w:p>
     <w:p>
@@ -1827,12 +1827,12 @@
     </w:p>
     <w:p>
       <w:r>
-        <w:t>Module: cost_center, profit_center, internal_order, cost_actuals, cost_element.</w:t>
+        <w:t>Module: cost_center, profit_center, internal_order, cost_actuals, cost_element, planning, allocation_cycle.</w:t>
       </w:r>
     </w:p>
     <w:p>
       <w:r>
-        <w:t>Quelltabellen: AUFK, CEPC, CEPCT, COBRB, COEP, CSKA, CSKB, CSKS, CSKT.</w:t>
+        <w:t>Quelltabellen: AUFK, CEPC, CEPCT, COBRB, COEP, COSP, COSS, CSKA, CSKB, CSKS, CSKT, T811C, T811S.</w:t>
       </w:r>
     </w:p>
     <w:p>
@@ -1868,12 +1868,12 @@
     </w:p>
     <w:p>
       <w:r>
-        <w:t>Module: gl_account, supplier, customer, gl_line_item, open_items.</w:t>
+        <w:t>Module: gl_account, supplier, customer, gl_line_item, open_items, bank, gl_opening_balance.</w:t>
       </w:r>
     </w:p>
     <w:p>
       <w:r>
-        <w:t>Quelltabellen: BKPF, BSAD, BSAK, BSAS, BSEG, BSID, BSIK, BSIS, KNA1, KNB1, KNVV, LFA1, LFB1, LFM1, SKA1, SKAT, SKB1.</w:t>
+        <w:t>Quelltabellen: BKPF, BNKA, BSAD, BSAK, BSAS, BSEG, BSID, BSIK, BSIS, FAGLFLEXT, GLT0, KNA1, KNB1, KNVV, LFA1, LFB1, LFM1, SKA1, SKAT, SKB1.</w:t>
       </w:r>
     </w:p>
     <w:p>
@@ -1896,12 +1896,12 @@
     </w:p>
     <w:p>
       <w:r>
-        <w:t>Module: sales_order, outbound_delivery, billing_document.</w:t>
+        <w:t>Module: sales_order, outbound_delivery, billing_document, pricing_condition.</w:t>
       </w:r>
     </w:p>
     <w:p>
       <w:r>
-        <w:t>Quelltabellen: LIKP, LIPS, VBAK, VBAP, VBEP, VBFA, VBKD, VBPA, VBRK, VBRP, VBUK, VBUP.</w:t>
+        <w:t>Quelltabellen: KONH, KONM, KONP, KONW, LIKP, LIPS, VBAK, VBAP, VBEP, VBFA, VBKD, VBPA, VBRK, VBRP, VBUK, VBUP.</w:t>
       </w:r>
     </w:p>
     <w:p>
@@ -1930,6 +1930,120 @@
     <w:p>
       <w:r>
         <w:t>Vertiefung: CUSTOMER_MANUAL_EN.md und CUSTOMER_MANUAL_DE.md, mapping, CUSTOMER_TEST.md, CROSS_DOMAIN_PREREQUISITES.md und ModuPorter-Domains-VDM.html. EWM, TM, FSCM, EHS und Industriekandidaten bleiben Machbarkeitspositionen ohne definierte Pakete.</w:t>
+      </w:r>
+    </w:p>
+    <w:p>
+      <w:r>
+        <w:br w:type="page"/>
+      </w:r>
+    </w:p>
+    <w:p>
+      <w:pPr>
+        <w:pStyle w:val="Heading1"/>
+      </w:pPr>
+      <w:r>
+        <w:t>Erweiterungen und Vorprüfung</w:t>
+      </w:r>
+    </w:p>
+    <w:p>
+      <w:r>
+        <w:t>Version 0.2.0 erweitert sieben bestehende Domänen um 15 Module und 31 Strukturen. Die bisherigen Module bleiben erhalten. Details zu jedem neuen Objekt stehen im jeweiligen zweisprachigen Kundenhandbuch und unter customer/coverage-requirements.json.</w:t>
+      </w:r>
+    </w:p>
+    <w:p>
+      <w:pPr>
+        <w:pStyle w:val="Heading2"/>
+      </w:pPr>
+      <w:r>
+        <w:t>Materialwirtschaft</w:t>
+      </w:r>
+    </w:p>
+    <w:p>
+      <w:r>
+        <w:t>purchasing_info_record, purchasing_contract.</w:t>
+      </w:r>
+    </w:p>
+    <w:p>
+      <w:pPr>
+        <w:pStyle w:val="Heading2"/>
+      </w:pPr>
+      <w:r>
+        <w:t>Qualitätsmanagement</w:t>
+      </w:r>
+    </w:p>
+    <w:p>
+      <w:r>
+        <w:t>master_inspection_characteristic, sampling_procedure.</w:t>
+      </w:r>
+    </w:p>
+    <w:p>
+      <w:pPr>
+        <w:pStyle w:val="Heading2"/>
+      </w:pPr>
+      <w:r>
+        <w:t>Projektsystem</w:t>
+      </w:r>
+    </w:p>
+    <w:p>
+      <w:r>
+        <w:t>network, budget, commitment, investment_measure.</w:t>
+      </w:r>
+    </w:p>
+    <w:p>
+      <w:pPr>
+        <w:pStyle w:val="Heading2"/>
+      </w:pPr>
+      <w:r>
+        <w:t>Produktionsplanung</w:t>
+      </w:r>
+    </w:p>
+    <w:p>
+      <w:r>
+        <w:t>production_version, production_confirmation.</w:t>
+      </w:r>
+    </w:p>
+    <w:p>
+      <w:pPr>
+        <w:pStyle w:val="Heading2"/>
+      </w:pPr>
+      <w:r>
+        <w:t>Controlling</w:t>
+      </w:r>
+    </w:p>
+    <w:p>
+      <w:r>
+        <w:t>planning, allocation_cycle.</w:t>
+      </w:r>
+    </w:p>
+    <w:p>
+      <w:pPr>
+        <w:pStyle w:val="Heading2"/>
+      </w:pPr>
+      <w:r>
+        <w:t>Finanzbuchhaltung</w:t>
+      </w:r>
+    </w:p>
+    <w:p>
+      <w:r>
+        <w:t>bank, gl_opening_balance.</w:t>
+      </w:r>
+    </w:p>
+    <w:p>
+      <w:pPr>
+        <w:pStyle w:val="Heading2"/>
+      </w:pPr>
+      <w:r>
+        <w:t>Vertrieb</w:t>
+      </w:r>
+    </w:p>
+    <w:p>
+      <w:r>
+        <w:t>pricing_condition.</w:t>
+      </w:r>
+    </w:p>
+    <w:p>
+      <w:r>
+        <w:t>migration_ddic.py vergleicht die Mappingfelder mit den vollständigen nativen DDIC Schlüsseln aus der .fields.csv Datei. Fehlende Felder, ausgelassene Schlüssel und zusätzliche vermeintliche Schlüssel stoppen diese Vorprüfung. Bei Fehlern zuerst die Kandidatenstruktur korrigieren. Das bestätigt keine SAP Aktivierung oder Zielbeladung.</w:t>
       </w:r>
     </w:p>
     <w:sectPr>

</xml_diff>